<commit_message>
docs: rebuild adaptive guided-learning papers
</commit_message>
<xml_diff>
--- a/research/guided_learning_paper/paper_core_zh.docx
+++ b/research/guided_learning_paper/paper_core_zh.docx
@@ -49,7 +49,7 @@
           <w:color w:val="000000"/>
           <w:sz w:val="22"/>
         </w:rPr>
-        <w:t>生成式AI能够快速给出程序与解释，也可能替代学生原本需要完成的分析、验证和调试。如何把AI嵌入具体学习活动，而不是把答案生成直接放在任务终点，是程序设计教学面临的实际问题。本研究在一门数据结构课程设计中部署了三阶段引导式学习：学生先外化算法思路，再完成代码结构识别与重构，最后向虚拟学生讲解算法并修正其错误代码。学生可直接编码，也可进入引导入口；教师鼓励体验，相关表现约占课程设计成绩的10%，且得分门槛较低。研究使用2026年7月16日导出的匿名平台数据，包括117名学生、492次引导会话和9940条阶段日志。考虑系统持续迭代，路径分析限定在相对稳定版本的398次会话；提交关联分析包含994个学生—作业对，并将首次提交前暴露分为无暴露、未完成和完成。结果显示，42名学生使用过引导功能，其中37名重复使用，36名跨作业使用。稳定版会话中，224次完成全部阶段，89次没有形成第一阶段有效记录，74次停在第二阶段，11次进入第三阶段后未完成。完成会话第三阶段活跃时长中位数为5.86分钟，对话轮数中位数为7轮。无暴露、未完成和完成暴露的首次满分率分别为71.83%、59.46%和65.57%。控制学生与作业固定效应并按学生聚类后，各主要关联的95%置信区间均跨越0；三水平模型只有32名学生提供个体内暴露变化。本研究据此把贡献限定为三阶段活动链的课堂部署与过程证据。结果说明，路径、回退和中止信息能补充完成率，但现有观察数据不能证明该设计带来学习增益。后续研究需采用集群随机或阶梯楔形设计，并加入解释质量盲评和迁移测验。</w:t>
+        <w:t>生成式AI容易替学生完成程序设计中的分析、验证和调试，因而需要把它放进受约束的学习活动，而不是直接放在答案终点。本文设计了一种状态驱动的三阶段引导方法：学生先外化算法思路，再识别并重构代码，最后向虚拟学生讲解算法并修正错误代码。智能体只依据当前会话状态调整提示、诊断或追问。研究场景为数据结构课程设计，学生可直接编码，也可进入引导；教师鼓励体验，相关表现约占课程设计成绩的10%，得分门槛较低。2026年7月16日导出的匿名数据涉及117名学生、492次引导会话和9940条阶段日志。路径分析限定于相对稳定版本的398次会话，提交关联分析包含994个学生—作业对。42名学生使用过引导功能，其中37名重复使用，36名跨作业使用。稳定版会话中，224次完成全部阶段，89次没有形成第一阶段有效记录，74次停在第二阶段，11次进入第三阶段后未完成。完成会话第三阶段活跃时长中位数为5.86分钟，对话轮数中位数为7轮。首次提交前无暴露、未完成暴露和完成暴露的满分率分别为71.83%、59.46%和65.57%；控制学生与作业固定效应并按学生聚类后，各主要关联的95%置信区间均跨越0，三水平模型仅有32名学生提供个体内暴露变化。本文的创新对象是三阶段学习方法，平台用于实施活动规则并记录过程。现有数据支持课堂采用和行为路径分析，不支持学习增益或因果判断。</w:t>
       </w:r>
     </w:p>
     <w:p>
@@ -103,7 +103,7 @@
           <w:color w:val="000000"/>
           <w:sz w:val="22"/>
         </w:rPr>
-        <w:t>生成式AI进入程序设计课程后，学生获得代码、定位错误和生成解释的成本明显降低。教学上的难点也随之变化：当模型能够直接给出可运行答案，完成任务不再充分代表学生经历了问题分析、代码组织和错误修正。Becker等指出，代码生成工具要求程序设计教育重新安排学生承担的认知工作[26]；国内关于生成式AI作业设计的研究同样主张把人机交互过程和表现性活动纳入评价[3]。因此，问题不只是“是否允许使用AI”，而是AI在学习活动中扮演什么角色，学生还需要做什么。</w:t>
+        <w:t>生成式AI可以直接给出代码、定位错误并生成解释，学生即使完成作业，也未必经历了问题分析、代码组织和错误修正。Becker等据此提出，AI代码生成正在改变程序设计任务中由学生承担的认知工作[1]。李海峰、王炜对作业设计与评价的讨论也提醒教师关注人机交互过程和表现性活动[2]。本研究由此追问：AI应当怎样参与学习活动，学生仍需完成哪些认知操作？</w:t>
       </w:r>
     </w:p>
     <w:p>
@@ -113,7 +113,7 @@
           <w:color w:val="000000"/>
           <w:sz w:val="22"/>
         </w:rPr>
-        <w:t>已有研究提供了三类可借鉴的活动。自我解释研究要求学习者说明步骤、条件和依据，解释质量取决于是否形成概念联系，而非是否提交了一段文字[15-18]。Parsons Problems等代码重构活动通过提供部分结构，减少从空白页开始编码的负担，但不同题型不能被视为同一种干预[19]。learning-by-teaching与可教智能体研究则把学生置于讲解者位置，使其组织知识、监控对方理解并处理错误[20-22]。这些机制各有证据基础，生成式AI使它们可以在同一在线任务中连续组织。</w:t>
+        <w:t>Wang等在45名本科生中开展了6周准实验，比较AI-Agent支持的协作学习与常规计算机支持协作学习，并测量成绩、自我效能、认知负荷和兴趣[3]。这项研究写清了分组、周期和结果测量。本文没有同类对照条件，只分析自然使用形成的日志。</w:t>
       </w:r>
     </w:p>
     <w:p>
@@ -123,7 +123,7 @@
           <w:color w:val="000000"/>
           <w:sz w:val="22"/>
         </w:rPr>
-        <w:t>国内与本研究最接近的是孙丹等对36名大学生生成式AI编程学习行为的分析。该研究结合屏幕记录、行为编码、滞后序列分析和认知网络分析，呈现学生提问与编码行为的联系[1]。本文关注的对象有所不同：平台预先规定了思路外化、代码重构和讲解纠错三个阶段，研究问题不是学生如何自由使用通用AI，而是这条活动链在真实课程中如何被进入、推进和中止。吴林静等从学习分析视角讨论编程过程[2]，近期研究也开始区分大学生使用生成式AI的态度、行为与能力[13]。这些工作提醒我们，平台行为不能直接替代能力测量。</w:t>
+        <w:t>另一些研究把智能体用于学习者模拟。Agent4Edu利用画像、记忆和行动模块生成学习者响应[4]，Classroom Simulacra依据学生历史与课程材料模拟在线学习行为[5]。Yusuf等对92篇高等教育对话智能体研究的综述，则从教学目的、角色和交互方式界定智能体[6]。本文面对真实学生，研究对象是会话内的活动调节，不生成合成学习者，也不保存跨作业画像。</w:t>
       </w:r>
     </w:p>
     <w:p>
@@ -133,7 +133,17 @@
           <w:color w:val="000000"/>
           <w:sz w:val="22"/>
         </w:rPr>
-        <w:t>本研究将三个阶段概括为一条“表达—辨识—讲解与修正”的活动链。这里的“活动链”是对系统设计的归纳，不是新理论。研究使用课程运行后导出的匿名日志，回答以下问题：</w:t>
+        <w:t>国内与本研究最接近的是孙丹等对36名大学生生成式AI编程学习行为的分析。该研究结合屏幕记录、行为编码、滞后序列分析和认知网络分析，呈现学生提问与编码行为的联系[7]。本文研究预先规定的思路外化、代码重构和讲解纠错活动，关注真实学生如何进入、推进或中止这条活动链。吴林静等从学习分析视角讨论了编程过程证据[8]；周雪涵等进一步区分大学生使用生成式AI的态度、行为与能力[9]。因此，点击、提示、对话和阶段完成只能描述平台内行为，不能替代能力测量。</w:t>
+      </w:r>
+    </w:p>
+    <w:p>
+      <w:r>
+        <w:rPr>
+          <w:rFonts w:ascii="Times New Roman" w:hAnsi="Times New Roman" w:eastAsia="宋体"/>
+          <w:color w:val="000000"/>
+          <w:sz w:val="22"/>
+        </w:rPr>
+        <w:t>本文把三个阶段概括为“表达—辨识—讲解与修正”的活动链。“活动链”是对学习方法的归纳，不是新理论；平台只是实施和记录这套方法的载体。研究使用课程运行后导出的匿名日志，回答以下问题：</w:t>
       </w:r>
     </w:p>
     <w:p>
@@ -203,7 +213,7 @@
           <w:color w:val="000000"/>
           <w:sz w:val="26"/>
         </w:rPr>
-        <w:t>2.1 从答案生成转向学习活动组织</w:t>
+        <w:t>2.1 从答案生成转向状态驱动的活动调节</w:t>
       </w:r>
     </w:p>
     <w:p>
@@ -213,7 +223,17 @@
           <w:color w:val="000000"/>
           <w:sz w:val="22"/>
         </w:rPr>
-        <w:t>生成式AI既可直接产出代码，也可承担提示、提问、模拟同伴和反馈等角色。教育聊天机器人综述显示，智能体的教学、同伴和可教角色对应不同的学习者任务[22]。人机协同研究也指出，机器与学习者的分工、角色辨识和自主度调整是设计中的实质问题[4]。如果系统始终扮演答案提供者，学生容易把问题分析和验证交给模型；若系统改变任务结构，AI也可用于制造需要学生解释和修正的对象。</w:t>
+        <w:t>生成式AI既能给出答案，也能提示、追问、模拟同伴或反馈。教育对话智能体的角色不同，学习者需要完成的任务也随之改变[6]；人机协同设计同样需要交代分工、角色和自主度[10]。本研究把智能体限制在既定活动规则内，使其根据学生当前状态调节下一步任务，而不让模型决定教学目标或替学生完成整段程序。</w:t>
+      </w:r>
+    </w:p>
+    <w:p>
+      <w:r>
+        <w:rPr>
+          <w:rFonts w:ascii="Times New Roman" w:hAnsi="Times New Roman" w:eastAsia="宋体"/>
+          <w:color w:val="000000"/>
+          <w:sz w:val="22"/>
+        </w:rPr>
+        <w:t>本文所称智能体，是在既定教学角色与活动规则下，读取学生当前会话状态，并据此生成提示、诊断或追问的生成式人工智能组件。其自适应发生在单次会话内部，不等同于跨作业学习者建模。这里的“状态驱动”是一种会话内微观自适应：系统依据学生已经提交的回答、提示次数、阶段进度、错误类型和对话历史选择后续反馈，不保存跨作业学生画像，也不进行跨作业记忆。</w:t>
       </w:r>
     </w:p>
     <w:p>
@@ -236,7 +256,7 @@
       <w:r>
         <w:drawing>
           <wp:inline xmlns:a="http://schemas.openxmlformats.org/drawingml/2006/main" xmlns:pic="http://schemas.openxmlformats.org/drawingml/2006/picture">
-            <wp:extent cx="5472000" cy="2997120"/>
+            <wp:extent cx="5472000" cy="3286647"/>
             <wp:docPr id="1" name="Picture 1"/>
             <wp:cNvGraphicFramePr>
               <a:graphicFrameLocks noChangeAspect="1"/>
@@ -257,7 +277,7 @@
                   <pic:spPr>
                     <a:xfrm>
                       <a:off x="0" y="0"/>
-                      <a:ext cx="5472000" cy="2997120"/>
+                      <a:ext cx="5472000" cy="3286647"/>
                     </a:xfrm>
                     <a:prstGeom prst="rect"/>
                   </pic:spPr>
@@ -306,7 +326,7 @@
           <w:color w:val="000000"/>
           <w:sz w:val="22"/>
         </w:rPr>
-        <w:t>自我解释并不是简单复述题目。Chi等发现，学习者对样例中的规则、条件和推理关系作出解释，与仅重读材料不同[15]；Renkl和后续研究进一步表明，学习者的解释方式和解释质量存在明显差异[16-17]。在线环境中的提示可以改变自我解释过程，同时也可能造成中断[18]。</w:t>
+        <w:t>自我解释不是简单复述题目。Chi等发现，学习者对样例中的规则、条件和推理关系作出解释，与仅重读材料不同[11]；Renkl及后续研究进一步表明，解释方式和质量存在明显差异[12-13]。在线提示可以改变自我解释过程，也可能造成中断[14]。</w:t>
       </w:r>
     </w:p>
     <w:p>
@@ -341,7 +361,7 @@
           <w:color w:val="000000"/>
           <w:sz w:val="22"/>
         </w:rPr>
-        <w:t>Parsons Problems通常把程序拆成打乱的代码块，由学习者恢复顺序或层级。系统综述显示，这类任务能降低空白页编码负担，但代码块、干扰项、缩进和反馈形式会改变任务性质[19]。CodeSense早期版本曾采用拖拽积木，稳定版改为逐步选择和填空。本文因此使用较宽的“代码重构”，不把稳定版等同于标准Parsons Problems。</w:t>
+        <w:t>Parsons Problems通常把程序拆成打乱的代码块，由学习者恢复顺序或层级。系统综述显示，这类任务能降低空白页编码负担，但代码块、干扰项、缩进和反馈形式会改变任务性质[15]。CodeSense早期版本曾采用拖拽积木，稳定版改为逐步选择和填空。本文因此使用较宽的“代码重构”，不把稳定版等同于标准Parsons Problems。</w:t>
       </w:r>
     </w:p>
     <w:p>
@@ -376,7 +396,7 @@
           <w:color w:val="000000"/>
           <w:sz w:val="22"/>
         </w:rPr>
-        <w:t>learning-by-teaching研究关注学生在准备讲授和实际讲授时进行知识组织的过程[20]。可教智能体进一步把学习对象变成需要学生教授的角色，学生可能因承担“让对方学会”的责任而投入更多努力[21]。不过，学生如何理解智能体的能动性也会影响交互[23]，不能把角色设定本身视为稳定机制。</w:t>
+        <w:t>learning-by-teaching研究关注学生在准备讲授和实际讲授时组织知识的过程[16]。可教智能体把学习对象变成需要学生教授的角色，学生可能因承担“让对方学会”的责任而投入更多努力[17]。学生如何理解智能体的能动性也会影响交互[18]，角色设定本身不能保证学习发生。</w:t>
       </w:r>
     </w:p>
     <w:p>
@@ -386,7 +406,7 @@
           <w:color w:val="000000"/>
           <w:sz w:val="22"/>
         </w:rPr>
-        <w:t>第三阶段让虚拟学生围绕算法连续追问，随后生成含有问题的代码，由学生定位并修正。平台记录对话轮次和错误代码修正事件，不向本研究数据包导出对话正文与完整代码。对话轮数代表发生了交互，不能自动解释为协商质量或深层理解；近期基于IRF理论的人机对话研究也说明，判断对话质量需要分析话轮功能[14]。</w:t>
+        <w:t>第三阶段让虚拟学生围绕算法连续追问，随后生成含有问题的代码，由学生定位并修正。平台记录对话轮次和错误代码修正事件，不向本研究数据包导出对话正文与完整代码。对话轮数只说明发生了交互，不能直接解释为协商质量或深层理解；基于IRF理论的人机对话研究也表明，对话质量需要结合话轮功能判断[19]。</w:t>
       </w:r>
     </w:p>
     <w:p>
@@ -486,7 +506,595 @@
           <w:color w:val="000000"/>
           <w:sz w:val="22"/>
         </w:rPr>
-        <w:t>学生选择引导后，系统按顺序开放三个阶段。第一阶段要求分题描述算法思路；第二阶段完成代码选择与填空并接受验证；第三阶段向虚拟学生讲解，回应追问并修正其错误代码。教师型Agent提供提示和阶段支架，学生型Agent承担被讲解和暴露错误的角色。学生也可退出流程后直接编码。</w:t>
+        <w:t>学生选择引导后，系统按顺序开放三个阶段。教师型Agent负责第一阶段提示，虚拟学生负责第三阶段追问和错误代码生成。两者的决策范围由活动规则限定，只读取当前状态并生成下一步内容。三阶段的状态输入、调节规则、学习者动作和日志证据如下。</w:t>
+      </w:r>
+    </w:p>
+    <w:tbl>
+      <w:tblPr>
+        <w:tblStyle w:val="TableGrid"/>
+        <w:tblW w:type="dxa" w:w="8787"/>
+        <w:jc w:val="left"/>
+        <w:tblLayout w:type="fixed"/>
+        <w:tblLook w:firstColumn="1" w:firstRow="1" w:lastColumn="0" w:lastRow="0" w:noHBand="0" w:noVBand="1" w:val="04A0"/>
+        <w:tblInd w:w="120" w:type="dxa"/>
+      </w:tblPr>
+      <w:tblGrid>
+        <w:gridCol w:w="488"/>
+        <w:gridCol w:w="2148"/>
+        <w:gridCol w:w="2148"/>
+        <w:gridCol w:w="2148"/>
+        <w:gridCol w:w="1855"/>
+      </w:tblGrid>
+      <w:tr>
+        <w:trPr>
+          <w:tblHeader w:val="true"/>
+        </w:trPr>
+        <w:tc>
+          <w:tcPr>
+            <w:tcW w:type="dxa" w:w="488"/>
+            <w:vAlign w:val="center"/>
+            <w:tcMar>
+              <w:top w:w="100" w:type="dxa"/>
+              <w:start w:w="120" w:type="dxa"/>
+              <w:bottom w:w="100" w:type="dxa"/>
+              <w:end w:w="120" w:type="dxa"/>
+            </w:tcMar>
+            <w:shd w:fill="F4F6F9"/>
+          </w:tcPr>
+          <w:p>
+            <w:pPr>
+              <w:spacing w:before="0" w:after="0" w:line="276" w:lineRule="auto"/>
+              <w:ind w:firstLine="0"/>
+              <w:jc w:val="center"/>
+            </w:pPr>
+            <w:r>
+              <w:rPr>
+                <w:rFonts w:ascii="Times New Roman" w:hAnsi="Times New Roman" w:eastAsia="宋体"/>
+                <w:b/>
+                <w:color w:val="000000"/>
+                <w:sz w:val="19"/>
+              </w:rPr>
+              <w:t>阶段</w:t>
+            </w:r>
+          </w:p>
+        </w:tc>
+        <w:tc>
+          <w:tcPr>
+            <w:tcW w:type="dxa" w:w="2148"/>
+            <w:vAlign w:val="center"/>
+            <w:tcMar>
+              <w:top w:w="100" w:type="dxa"/>
+              <w:start w:w="120" w:type="dxa"/>
+              <w:bottom w:w="100" w:type="dxa"/>
+              <w:end w:w="120" w:type="dxa"/>
+            </w:tcMar>
+            <w:shd w:fill="F4F6F9"/>
+          </w:tcPr>
+          <w:p>
+            <w:pPr>
+              <w:spacing w:before="0" w:after="0" w:line="276" w:lineRule="auto"/>
+              <w:ind w:firstLine="0"/>
+              <w:jc w:val="left"/>
+            </w:pPr>
+            <w:r>
+              <w:rPr>
+                <w:rFonts w:ascii="Times New Roman" w:hAnsi="Times New Roman" w:eastAsia="宋体"/>
+                <w:b/>
+                <w:color w:val="000000"/>
+                <w:sz w:val="19"/>
+              </w:rPr>
+              <w:t>状态输入</w:t>
+            </w:r>
+          </w:p>
+        </w:tc>
+        <w:tc>
+          <w:tcPr>
+            <w:tcW w:type="dxa" w:w="2148"/>
+            <w:vAlign w:val="center"/>
+            <w:tcMar>
+              <w:top w:w="100" w:type="dxa"/>
+              <w:start w:w="120" w:type="dxa"/>
+              <w:bottom w:w="100" w:type="dxa"/>
+              <w:end w:w="120" w:type="dxa"/>
+            </w:tcMar>
+            <w:shd w:fill="F4F6F9"/>
+          </w:tcPr>
+          <w:p>
+            <w:pPr>
+              <w:spacing w:before="0" w:after="0" w:line="276" w:lineRule="auto"/>
+              <w:ind w:firstLine="0"/>
+              <w:jc w:val="center"/>
+            </w:pPr>
+            <w:r>
+              <w:rPr>
+                <w:rFonts w:ascii="Times New Roman" w:hAnsi="Times New Roman" w:eastAsia="宋体"/>
+                <w:b/>
+                <w:color w:val="000000"/>
+                <w:sz w:val="19"/>
+              </w:rPr>
+              <w:t>调节规则</w:t>
+            </w:r>
+          </w:p>
+        </w:tc>
+        <w:tc>
+          <w:tcPr>
+            <w:tcW w:type="dxa" w:w="2148"/>
+            <w:vAlign w:val="center"/>
+            <w:tcMar>
+              <w:top w:w="100" w:type="dxa"/>
+              <w:start w:w="120" w:type="dxa"/>
+              <w:bottom w:w="100" w:type="dxa"/>
+              <w:end w:w="120" w:type="dxa"/>
+            </w:tcMar>
+            <w:shd w:fill="F4F6F9"/>
+          </w:tcPr>
+          <w:p>
+            <w:pPr>
+              <w:spacing w:before="0" w:after="0" w:line="276" w:lineRule="auto"/>
+              <w:ind w:firstLine="0"/>
+              <w:jc w:val="center"/>
+            </w:pPr>
+            <w:r>
+              <w:rPr>
+                <w:rFonts w:ascii="Times New Roman" w:hAnsi="Times New Roman" w:eastAsia="宋体"/>
+                <w:b/>
+                <w:color w:val="000000"/>
+                <w:sz w:val="19"/>
+              </w:rPr>
+              <w:t>学习者动作</w:t>
+            </w:r>
+          </w:p>
+        </w:tc>
+        <w:tc>
+          <w:tcPr>
+            <w:tcW w:type="dxa" w:w="1855"/>
+            <w:vAlign w:val="center"/>
+            <w:tcMar>
+              <w:top w:w="100" w:type="dxa"/>
+              <w:start w:w="120" w:type="dxa"/>
+              <w:bottom w:w="100" w:type="dxa"/>
+              <w:end w:w="120" w:type="dxa"/>
+            </w:tcMar>
+            <w:shd w:fill="F4F6F9"/>
+          </w:tcPr>
+          <w:p>
+            <w:pPr>
+              <w:spacing w:before="0" w:after="0" w:line="276" w:lineRule="auto"/>
+              <w:ind w:firstLine="0"/>
+              <w:jc w:val="center"/>
+            </w:pPr>
+            <w:r>
+              <w:rPr>
+                <w:rFonts w:ascii="Times New Roman" w:hAnsi="Times New Roman" w:eastAsia="宋体"/>
+                <w:b/>
+                <w:color w:val="000000"/>
+                <w:sz w:val="19"/>
+              </w:rPr>
+              <w:t>日志证据</w:t>
+            </w:r>
+          </w:p>
+        </w:tc>
+      </w:tr>
+      <w:tr>
+        <w:tc>
+          <w:tcPr>
+            <w:tcW w:type="dxa" w:w="488"/>
+            <w:vAlign w:val="center"/>
+            <w:tcMar>
+              <w:top w:w="100" w:type="dxa"/>
+              <w:start w:w="120" w:type="dxa"/>
+              <w:bottom w:w="100" w:type="dxa"/>
+              <w:end w:w="120" w:type="dxa"/>
+            </w:tcMar>
+          </w:tcPr>
+          <w:p>
+            <w:pPr>
+              <w:spacing w:before="0" w:after="0" w:line="276" w:lineRule="auto"/>
+              <w:ind w:firstLine="0"/>
+              <w:jc w:val="center"/>
+            </w:pPr>
+            <w:r>
+              <w:rPr>
+                <w:rFonts w:ascii="Times New Roman" w:hAnsi="Times New Roman" w:eastAsia="宋体"/>
+                <w:color w:val="000000"/>
+                <w:sz w:val="19"/>
+              </w:rPr>
+              <w:t>思路外化</w:t>
+            </w:r>
+          </w:p>
+        </w:tc>
+        <w:tc>
+          <w:tcPr>
+            <w:tcW w:type="dxa" w:w="2148"/>
+            <w:vAlign w:val="center"/>
+            <w:tcMar>
+              <w:top w:w="100" w:type="dxa"/>
+              <w:start w:w="120" w:type="dxa"/>
+              <w:bottom w:w="100" w:type="dxa"/>
+              <w:end w:w="120" w:type="dxa"/>
+            </w:tcMar>
+          </w:tcPr>
+          <w:p>
+            <w:pPr>
+              <w:spacing w:before="0" w:after="0" w:line="276" w:lineRule="auto"/>
+              <w:ind w:firstLine="0"/>
+              <w:jc w:val="left"/>
+            </w:pPr>
+            <w:r>
+              <w:rPr>
+                <w:rFonts w:ascii="Times New Roman" w:hAnsi="Times New Roman" w:eastAsia="宋体"/>
+                <w:color w:val="000000"/>
+                <w:sz w:val="19"/>
+              </w:rPr>
+              <w:t>当前分题回答、提示次数、未答或错误步骤、会话内对话历史</w:t>
+            </w:r>
+          </w:p>
+        </w:tc>
+        <w:tc>
+          <w:tcPr>
+            <w:tcW w:type="dxa" w:w="2148"/>
+            <w:vAlign w:val="center"/>
+            <w:tcMar>
+              <w:top w:w="100" w:type="dxa"/>
+              <w:start w:w="120" w:type="dxa"/>
+              <w:bottom w:w="100" w:type="dxa"/>
+              <w:end w:w="120" w:type="dxa"/>
+            </w:tcMar>
+          </w:tcPr>
+          <w:p>
+            <w:pPr>
+              <w:spacing w:before="0" w:after="0" w:line="276" w:lineRule="auto"/>
+              <w:ind w:firstLine="0"/>
+              <w:jc w:val="center"/>
+            </w:pPr>
+            <w:r>
+              <w:rPr>
+                <w:rFonts w:ascii="Times New Roman" w:hAnsi="Times New Roman" w:eastAsia="宋体"/>
+                <w:color w:val="000000"/>
+                <w:sz w:val="19"/>
+              </w:rPr>
+              <w:t>依据缺失步骤和已有提示生成针对性追问；不直接给出完整算法或代码</w:t>
+            </w:r>
+          </w:p>
+        </w:tc>
+        <w:tc>
+          <w:tcPr>
+            <w:tcW w:type="dxa" w:w="2148"/>
+            <w:vAlign w:val="center"/>
+            <w:tcMar>
+              <w:top w:w="100" w:type="dxa"/>
+              <w:start w:w="120" w:type="dxa"/>
+              <w:bottom w:w="100" w:type="dxa"/>
+              <w:end w:w="120" w:type="dxa"/>
+            </w:tcMar>
+          </w:tcPr>
+          <w:p>
+            <w:pPr>
+              <w:spacing w:before="0" w:after="0" w:line="276" w:lineRule="auto"/>
+              <w:ind w:firstLine="0"/>
+              <w:jc w:val="center"/>
+            </w:pPr>
+            <w:r>
+              <w:rPr>
+                <w:rFonts w:ascii="Times New Roman" w:hAnsi="Times New Roman" w:eastAsia="宋体"/>
+                <w:color w:val="000000"/>
+                <w:sz w:val="19"/>
+              </w:rPr>
+              <w:t>分题说明算法步骤与依据，必要时继续作答</w:t>
+            </w:r>
+          </w:p>
+        </w:tc>
+        <w:tc>
+          <w:tcPr>
+            <w:tcW w:type="dxa" w:w="1855"/>
+            <w:vAlign w:val="center"/>
+            <w:tcMar>
+              <w:top w:w="100" w:type="dxa"/>
+              <w:start w:w="120" w:type="dxa"/>
+              <w:bottom w:w="100" w:type="dxa"/>
+              <w:end w:w="120" w:type="dxa"/>
+            </w:tcMar>
+          </w:tcPr>
+          <w:p>
+            <w:pPr>
+              <w:spacing w:before="0" w:after="0" w:line="276" w:lineRule="auto"/>
+              <w:ind w:firstLine="0"/>
+              <w:jc w:val="center"/>
+            </w:pPr>
+            <w:r>
+              <w:rPr>
+                <w:rFonts w:ascii="Times New Roman" w:hAnsi="Times New Roman" w:eastAsia="宋体"/>
+                <w:color w:val="000000"/>
+                <w:sz w:val="19"/>
+              </w:rPr>
+              <w:t>回答提交、提示请求、阶段进度与通过事件</w:t>
+            </w:r>
+          </w:p>
+        </w:tc>
+      </w:tr>
+      <w:tr>
+        <w:tc>
+          <w:tcPr>
+            <w:tcW w:type="dxa" w:w="488"/>
+            <w:vAlign w:val="center"/>
+            <w:tcMar>
+              <w:top w:w="100" w:type="dxa"/>
+              <w:start w:w="120" w:type="dxa"/>
+              <w:bottom w:w="100" w:type="dxa"/>
+              <w:end w:w="120" w:type="dxa"/>
+            </w:tcMar>
+          </w:tcPr>
+          <w:p>
+            <w:pPr>
+              <w:spacing w:before="0" w:after="0" w:line="276" w:lineRule="auto"/>
+              <w:ind w:firstLine="0"/>
+              <w:jc w:val="center"/>
+            </w:pPr>
+            <w:r>
+              <w:rPr>
+                <w:rFonts w:ascii="Times New Roman" w:hAnsi="Times New Roman" w:eastAsia="宋体"/>
+                <w:color w:val="000000"/>
+                <w:sz w:val="19"/>
+              </w:rPr>
+              <w:t>代码重构</w:t>
+            </w:r>
+          </w:p>
+        </w:tc>
+        <w:tc>
+          <w:tcPr>
+            <w:tcW w:type="dxa" w:w="2148"/>
+            <w:vAlign w:val="center"/>
+            <w:tcMar>
+              <w:top w:w="100" w:type="dxa"/>
+              <w:start w:w="120" w:type="dxa"/>
+              <w:bottom w:w="100" w:type="dxa"/>
+              <w:end w:w="120" w:type="dxa"/>
+            </w:tcMar>
+          </w:tcPr>
+          <w:p>
+            <w:pPr>
+              <w:spacing w:before="0" w:after="0" w:line="276" w:lineRule="auto"/>
+              <w:ind w:firstLine="0"/>
+              <w:jc w:val="left"/>
+            </w:pPr>
+            <w:r>
+              <w:rPr>
+                <w:rFonts w:ascii="Times New Roman" w:hAnsi="Times New Roman" w:eastAsia="宋体"/>
+                <w:color w:val="000000"/>
+                <w:sz w:val="19"/>
+              </w:rPr>
+              <w:t>第一阶段进度、当前选项或填空、代码块错误与验证结果</w:t>
+            </w:r>
+          </w:p>
+        </w:tc>
+        <w:tc>
+          <w:tcPr>
+            <w:tcW w:type="dxa" w:w="2148"/>
+            <w:vAlign w:val="center"/>
+            <w:tcMar>
+              <w:top w:w="100" w:type="dxa"/>
+              <w:start w:w="120" w:type="dxa"/>
+              <w:bottom w:w="100" w:type="dxa"/>
+              <w:end w:w="120" w:type="dxa"/>
+            </w:tcMar>
+          </w:tcPr>
+          <w:p>
+            <w:pPr>
+              <w:spacing w:before="0" w:after="0" w:line="276" w:lineRule="auto"/>
+              <w:ind w:firstLine="0"/>
+              <w:jc w:val="center"/>
+            </w:pPr>
+            <w:r>
+              <w:rPr>
+                <w:rFonts w:ascii="Times New Roman" w:hAnsi="Times New Roman" w:eastAsia="宋体"/>
+                <w:color w:val="000000"/>
+                <w:sz w:val="19"/>
+              </w:rPr>
+              <w:t>依据验证状态返回局部诊断，保持题目既定结构</w:t>
+            </w:r>
+          </w:p>
+        </w:tc>
+        <w:tc>
+          <w:tcPr>
+            <w:tcW w:type="dxa" w:w="2148"/>
+            <w:vAlign w:val="center"/>
+            <w:tcMar>
+              <w:top w:w="100" w:type="dxa"/>
+              <w:start w:w="120" w:type="dxa"/>
+              <w:bottom w:w="100" w:type="dxa"/>
+              <w:end w:w="120" w:type="dxa"/>
+            </w:tcMar>
+          </w:tcPr>
+          <w:p>
+            <w:pPr>
+              <w:spacing w:before="0" w:after="0" w:line="276" w:lineRule="auto"/>
+              <w:ind w:firstLine="0"/>
+              <w:jc w:val="center"/>
+            </w:pPr>
+            <w:r>
+              <w:rPr>
+                <w:rFonts w:ascii="Times New Roman" w:hAnsi="Times New Roman" w:eastAsia="宋体"/>
+                <w:color w:val="000000"/>
+                <w:sz w:val="19"/>
+              </w:rPr>
+              <w:t>识别代码结构，完成选择或填空并再次验证</w:t>
+            </w:r>
+          </w:p>
+        </w:tc>
+        <w:tc>
+          <w:tcPr>
+            <w:tcW w:type="dxa" w:w="1855"/>
+            <w:vAlign w:val="center"/>
+            <w:tcMar>
+              <w:top w:w="100" w:type="dxa"/>
+              <w:start w:w="120" w:type="dxa"/>
+              <w:bottom w:w="100" w:type="dxa"/>
+              <w:end w:w="120" w:type="dxa"/>
+            </w:tcMar>
+          </w:tcPr>
+          <w:p>
+            <w:pPr>
+              <w:spacing w:before="0" w:after="0" w:line="276" w:lineRule="auto"/>
+              <w:ind w:firstLine="0"/>
+              <w:jc w:val="center"/>
+            </w:pPr>
+            <w:r>
+              <w:rPr>
+                <w:rFonts w:ascii="Times New Roman" w:hAnsi="Times New Roman" w:eastAsia="宋体"/>
+                <w:color w:val="000000"/>
+                <w:sz w:val="19"/>
+              </w:rPr>
+              <w:t>作答、验证失败、重试与阶段通过事件</w:t>
+            </w:r>
+          </w:p>
+        </w:tc>
+      </w:tr>
+      <w:tr>
+        <w:tc>
+          <w:tcPr>
+            <w:tcW w:type="dxa" w:w="488"/>
+            <w:vAlign w:val="center"/>
+            <w:tcMar>
+              <w:top w:w="100" w:type="dxa"/>
+              <w:start w:w="120" w:type="dxa"/>
+              <w:bottom w:w="100" w:type="dxa"/>
+              <w:end w:w="120" w:type="dxa"/>
+            </w:tcMar>
+          </w:tcPr>
+          <w:p>
+            <w:pPr>
+              <w:spacing w:before="0" w:after="0" w:line="276" w:lineRule="auto"/>
+              <w:ind w:firstLine="0"/>
+              <w:jc w:val="center"/>
+            </w:pPr>
+            <w:r>
+              <w:rPr>
+                <w:rFonts w:ascii="Times New Roman" w:hAnsi="Times New Roman" w:eastAsia="宋体"/>
+                <w:color w:val="000000"/>
+                <w:sz w:val="19"/>
+              </w:rPr>
+              <w:t>讲解纠错</w:t>
+            </w:r>
+          </w:p>
+        </w:tc>
+        <w:tc>
+          <w:tcPr>
+            <w:tcW w:type="dxa" w:w="2148"/>
+            <w:vAlign w:val="center"/>
+            <w:tcMar>
+              <w:top w:w="100" w:type="dxa"/>
+              <w:start w:w="120" w:type="dxa"/>
+              <w:bottom w:w="100" w:type="dxa"/>
+              <w:end w:w="120" w:type="dxa"/>
+            </w:tcMar>
+          </w:tcPr>
+          <w:p>
+            <w:pPr>
+              <w:spacing w:before="0" w:after="0" w:line="276" w:lineRule="auto"/>
+              <w:ind w:firstLine="0"/>
+              <w:jc w:val="left"/>
+            </w:pPr>
+            <w:r>
+              <w:rPr>
+                <w:rFonts w:ascii="Times New Roman" w:hAnsi="Times New Roman" w:eastAsia="宋体"/>
+                <w:color w:val="000000"/>
+                <w:sz w:val="19"/>
+              </w:rPr>
+              <w:t>对话历史、讲解记录、错误类型、代码修正结果</w:t>
+            </w:r>
+          </w:p>
+        </w:tc>
+        <w:tc>
+          <w:tcPr>
+            <w:tcW w:type="dxa" w:w="2148"/>
+            <w:vAlign w:val="center"/>
+            <w:tcMar>
+              <w:top w:w="100" w:type="dxa"/>
+              <w:start w:w="120" w:type="dxa"/>
+              <w:bottom w:w="100" w:type="dxa"/>
+              <w:end w:w="120" w:type="dxa"/>
+            </w:tcMar>
+          </w:tcPr>
+          <w:p>
+            <w:pPr>
+              <w:spacing w:before="0" w:after="0" w:line="276" w:lineRule="auto"/>
+              <w:ind w:firstLine="0"/>
+              <w:jc w:val="center"/>
+            </w:pPr>
+            <w:r>
+              <w:rPr>
+                <w:rFonts w:ascii="Times New Roman" w:hAnsi="Times New Roman" w:eastAsia="宋体"/>
+                <w:color w:val="000000"/>
+                <w:sz w:val="19"/>
+              </w:rPr>
+              <w:t>根据已讲内容追问；达到活动条件后给出待修正代码</w:t>
+            </w:r>
+          </w:p>
+        </w:tc>
+        <w:tc>
+          <w:tcPr>
+            <w:tcW w:type="dxa" w:w="2148"/>
+            <w:vAlign w:val="center"/>
+            <w:tcMar>
+              <w:top w:w="100" w:type="dxa"/>
+              <w:start w:w="120" w:type="dxa"/>
+              <w:bottom w:w="100" w:type="dxa"/>
+              <w:end w:w="120" w:type="dxa"/>
+            </w:tcMar>
+          </w:tcPr>
+          <w:p>
+            <w:pPr>
+              <w:spacing w:before="0" w:after="0" w:line="276" w:lineRule="auto"/>
+              <w:ind w:firstLine="0"/>
+              <w:jc w:val="center"/>
+            </w:pPr>
+            <w:r>
+              <w:rPr>
+                <w:rFonts w:ascii="Times New Roman" w:hAnsi="Times New Roman" w:eastAsia="宋体"/>
+                <w:color w:val="000000"/>
+                <w:sz w:val="19"/>
+              </w:rPr>
+              <w:t>向虚拟学生讲解，回应追问，定位并修正错误代码</w:t>
+            </w:r>
+          </w:p>
+        </w:tc>
+        <w:tc>
+          <w:tcPr>
+            <w:tcW w:type="dxa" w:w="1855"/>
+            <w:vAlign w:val="center"/>
+            <w:tcMar>
+              <w:top w:w="100" w:type="dxa"/>
+              <w:start w:w="120" w:type="dxa"/>
+              <w:bottom w:w="100" w:type="dxa"/>
+              <w:end w:w="120" w:type="dxa"/>
+            </w:tcMar>
+          </w:tcPr>
+          <w:p>
+            <w:pPr>
+              <w:spacing w:before="0" w:after="0" w:line="276" w:lineRule="auto"/>
+              <w:ind w:firstLine="0"/>
+              <w:jc w:val="center"/>
+            </w:pPr>
+            <w:r>
+              <w:rPr>
+                <w:rFonts w:ascii="Times New Roman" w:hAnsi="Times New Roman" w:eastAsia="宋体"/>
+                <w:color w:val="000000"/>
+                <w:sz w:val="19"/>
+              </w:rPr>
+              <w:t>对话轮次、错误代码展示、修正与完成事件</w:t>
+            </w:r>
+          </w:p>
+        </w:tc>
+      </w:tr>
+    </w:tbl>
+    <w:p>
+      <w:r>
+        <w:rPr>
+          <w:rFonts w:ascii="Times New Roman" w:hAnsi="Times New Roman" w:eastAsia="宋体"/>
+          <w:color w:val="000000"/>
+          <w:sz w:val="22"/>
+        </w:rPr>
+        <w:t>学生可随时退出引导并直接编码。平台功能、接口和技术栈用于落实上述活动规则和保存日志，不构成本文的创新结论。</w:t>
       </w:r>
     </w:p>
     <w:p>
@@ -5657,7 +6265,7 @@
           <w:color w:val="000000"/>
           <w:sz w:val="22"/>
         </w:rPr>
-        <w:t>三阶段设计的价值首先体现在任务组织，而不是结果提升。系统没有在入口直接给出完整代码，而是让学生依次表达解法、辨识结构、向虚拟学生讲解并修正错误。这样的安排与自我解释、代码重构和learning-by-teaching的既有研究相接[15-23]，也回应了生成式AI时代作业设计对过程活动和真实性评价的要求[3,5-6]。</w:t>
+        <w:t>三阶段方法改变的是学习活动的组织方式。系统没有在入口给出完整代码，而是让学生依次表达解法、辨识结构、向虚拟学生讲解并修正错误。这一安排组合了自我解释、代码重构和learning-by-teaching中的已有机制[11-18]，并把每个阶段的学生动作和日志证据对应起来。本文不把单一机制或平台功能写成首创。</w:t>
       </w:r>
     </w:p>
     <w:p>
@@ -5667,7 +6275,17 @@
           <w:color w:val="000000"/>
           <w:sz w:val="22"/>
         </w:rPr>
-        <w:t>本文的经验证据主要说明这条活动链能够在真实课程中运行并产生可区分的过程记录。第三阶段完整会话通常包含7—8轮对话和1—2次代码修正，说明“学生教AI”在平台中不是一个静态标签，而是由连续操作构成。不过，本研究没有对讲解内容评分，不能判断学生是否真正说清算法原理。角色反转是活动条件，不是学习发生的证明。</w:t>
+        <w:t>本文的过程证据说明，这条活动链在真实课程中产生了可区分的阶段记录。第三阶段完整会话通常包含7—8轮对话和1—2次代码修正，“学生教AI”由连续操作构成，不是静态标签。本研究没有对讲解内容评分，不能判断学生是否说清算法原理。角色反转是活动条件，不是学习发生的证明。</w:t>
+      </w:r>
+    </w:p>
+    <w:p>
+      <w:r>
+        <w:rPr>
+          <w:rFonts w:ascii="Times New Roman" w:hAnsi="Times New Roman" w:eastAsia="宋体"/>
+          <w:color w:val="000000"/>
+          <w:sz w:val="22"/>
+        </w:rPr>
+        <w:t>状态驱动调节与固定提示的差别，在于后续内容是否读取本次会话已经发生的动作。固定提示可按预设顺序展示同一问题；本文系统会结合回答、提示次数、验证结果和对话历史选择局部提示或追问。不过，这种差别只描述调节机制。现有研究没有设置固定提示组，因而不能判断状态驱动调节是否更有效。</w:t>
       </w:r>
     </w:p>
     <w:p>
@@ -5682,7 +6300,52 @@
           <w:color w:val="000000"/>
           <w:sz w:val="26"/>
         </w:rPr>
-        <w:t>5.2 真实课堂中的推进、回退与退出</w:t>
+        <w:t>5.2 会话内智能体与学习者模拟的边界</w:t>
+      </w:r>
+    </w:p>
+    <w:p>
+      <w:r>
+        <w:rPr>
+          <w:rFonts w:ascii="Times New Roman" w:hAnsi="Times New Roman" w:eastAsia="宋体"/>
+          <w:color w:val="000000"/>
+          <w:sz w:val="22"/>
+        </w:rPr>
+        <w:t>Agent4Edu和Classroom Simulacra保存画像、历史或反思状态，用于生成学习者响应并评价模拟质量[4-5]。本文不模拟学生。教师型Agent和虚拟学生面对真实学生，只读取单次会话内的状态，用来推进三阶段活动；跨作业使用仅表示同一学生在多项作业中建立过会话，不表示智能体具有跨作业记忆。</w:t>
+      </w:r>
+    </w:p>
+    <w:p>
+      <w:r>
+        <w:rPr>
+          <w:rFonts w:ascii="Times New Roman" w:hAnsi="Times New Roman" w:eastAsia="宋体"/>
+          <w:color w:val="000000"/>
+          <w:sz w:val="22"/>
+        </w:rPr>
+        <w:t>EduPlanner把评价、优化和题目分析交给不同Agent，并逐一说明各角色的输入、职责和输出[20]。这种写法有助于澄清多角色系统的分工，但其研究对象是教学设计生成，而不是课堂中的实时引导。本文借鉴角色职责的表达方式，不沿用其学习群体建模和教学设计评价指标；教师型Agent负责提供受约束的提示，虚拟学生负责追问与呈现待修正代码，真正完成表达、判断和修改的仍是学生。</w:t>
+      </w:r>
+    </w:p>
+    <w:p>
+      <w:r>
+        <w:rPr>
+          <w:rFonts w:ascii="Times New Roman" w:hAnsi="Times New Roman" w:eastAsia="宋体"/>
+          <w:color w:val="000000"/>
+          <w:sz w:val="22"/>
+        </w:rPr>
+        <w:t>这一边界也限定了“自适应”的含义。本文讨论的是状态驱动的微观调节，不是个性化学习系统中的长期学生模型。下一轮若扩展纵向状态，应先取得学生明确同意，规定可保存字段、用途和期限，再单独验证模型是否准确、公平。未经同意的历史数据不能直接转成纵向学生模型。</w:t>
+      </w:r>
+    </w:p>
+    <w:p>
+      <w:pPr>
+        <w:pStyle w:val="Heading2"/>
+        <w:ind w:firstLine="0"/>
+      </w:pPr>
+      <w:r>
+        <w:rPr>
+          <w:rFonts w:ascii="Times New Roman" w:hAnsi="Times New Roman" w:eastAsia="黑体"/>
+          <w:b/>
+          <w:color w:val="000000"/>
+          <w:sz w:val="26"/>
+        </w:rPr>
+        <w:t>5.3 真实课堂中的推进、回退与退出</w:t>
       </w:r>
     </w:p>
     <w:p>
@@ -5717,7 +6380,7 @@
           <w:color w:val="000000"/>
           <w:sz w:val="26"/>
         </w:rPr>
-        <w:t>5.3 成绩激励、自选择与结果解释</w:t>
+        <w:t>5.4 成绩激励、自选择与结果解释</w:t>
       </w:r>
     </w:p>
     <w:p>
@@ -5737,7 +6400,17 @@
           <w:color w:val="000000"/>
           <w:sz w:val="22"/>
         </w:rPr>
-        <w:t>提交关联结果呈现了典型的观察数据问题。未完成和完成暴露组的首次成绩低于无暴露组，可能是困难学生主动求助，也可能是引导占用提交前时间，或不同作业的使用情境不同。学生与作业固定效应减少了部分稳定差异，但只有31—32名学生提供暴露变化，估计精度有限。更重要的是，模型无法控制同一学生当时是否卡住、是否被教师提醒和是否临近截止。结果应理解为“没有观察到稳定的条件内正向关联”，不能写成效果结论。</w:t>
+        <w:t>提交关联结果呈现了典型的观察数据问题。未完成和完成暴露组的首次成绩低于无暴露组，可能是困难学生主动求助，也可能是引导占用提交前时间，或不同作业的使用情境不同。学生与作业固定效应减少了部分稳定差异，但只有31—32名学生提供暴露变化，估计精度有限。模型也无法控制同一学生当时是否卡住、是否被教师提醒和是否临近截止。结果应理解为“没有观察到稳定的条件内正向关联”，不能写成效果结论。</w:t>
+      </w:r>
+    </w:p>
+    <w:p>
+      <w:r>
+        <w:rPr>
+          <w:rFonts w:ascii="Times New Roman" w:hAnsi="Times New Roman" w:eastAsia="宋体"/>
+          <w:color w:val="000000"/>
+          <w:sz w:val="22"/>
+        </w:rPr>
+        <w:t>Wang等的程序设计课程研究采用AI-CL组与CSCL组的准实验比较，并测量学习成绩等结果[3]。本文没有相应的对照组、前后测和结果测量，因此只能把该研究作为方法参照，不能将两项研究的结论并列比较。日志关联不等于组间效果。</w:t>
       </w:r>
     </w:p>
     <w:p>
@@ -5752,7 +6425,7 @@
           <w:color w:val="000000"/>
           <w:sz w:val="26"/>
         </w:rPr>
-        <w:t>5.4 教学启示</w:t>
+        <w:t>5.5 教学启示</w:t>
       </w:r>
     </w:p>
     <w:p>
@@ -5782,7 +6455,7 @@
           <w:color w:val="000000"/>
           <w:sz w:val="22"/>
         </w:rPr>
-        <w:t>第三，系统迭代必须留下版本边界。真实课堂工具往往边使用边更新，若分析时把拖拽积木版和选择填空版合并，就很难解释路径变化。Git记录可以近似恢复部署变化，但更稳妥的做法是在平台事件中写入明确版本号和配置快照。</w:t>
+        <w:t>第三，系统迭代必须留下版本边界。真实课堂工具往往边使用边更新，若分析时把拖拽积木版和选择填空版合并，就很难解释路径变化。Git记录可以近似恢复部署变化，更稳妥的做法是在平台事件中写入明确版本号和配置快照。</w:t>
       </w:r>
     </w:p>
     <w:p>
@@ -5807,7 +6480,7 @@
           <w:color w:val="000000"/>
           <w:sz w:val="22"/>
         </w:rPr>
-        <w:t>本研究在数据结构课程设计中部署了由思路外化、代码重构和讲解纠错组成的三阶段引导。42名学生产生492次会话，其中重复与跨作业使用占主要部分。稳定版398次会话呈现四条清楚路径，第二阶段是主要中止位置，第三阶段在完成会话中形成较稳定的对话和修正记录。994个学生—作业对的关联分析没有显示首次提交前引导与提交表现之间的稳定正向关系，置信区间也不足以排除有意义的正向或负向差异。</w:t>
+        <w:t>本研究在数据结构课程设计中部署了由思路外化、代码重构和讲解纠错组成的状态驱动三阶段方法。42名学生产生492次会话，其中重复与跨作业使用占主要部分。稳定版398次会话呈现四条清楚路径，第二阶段是主要中止位置，第三阶段在完成会话中形成较稳定的对话和修正记录。994个学生—作业对的关联分析没有显示首次提交前引导与提交表现之间的稳定正向关系，置信区间也不足以排除有意义的正向或负向差异。平台实现了活动规则并留下日志，本文的贡献是学习方法及其课堂过程证据。</w:t>
       </w:r>
     </w:p>
     <w:p>
@@ -5857,7 +6530,7 @@
           <w:color w:val="000000"/>
           <w:sz w:val="21"/>
         </w:rPr>
-        <w:t>[1] 孙丹, 朱城聪, 许作栋, 等. 基于生成式人工智能的大学生编程学习行为分析研究[J]. 电化教育研究, 2024, 45(3): 113-120. DOI:10.13811/j.cnki.eer.2024.03.016.</w:t>
+        <w:t>[1] BECKER B A, et al. Programming Is Hard—or at Least It Used to Be: Educational Opportunities and Challenges of AI Code Generation[C]//Proceedings of the 54th ACM Technical Symposium on Computer Science Education V. 1. New York: ACM, 2023: 500-506. DOI:10.1145/3545945.3569759.</w:t>
       </w:r>
     </w:p>
     <w:p>
@@ -5872,7 +6545,7 @@
           <w:color w:val="000000"/>
           <w:sz w:val="21"/>
         </w:rPr>
-        <w:t>[2] 吴林静, 戴心来, 赵蔚, 等. 学习分析视域下学习者编程过程分析研究[J]. 现代远距离教育, 2020(2): 68-75.</w:t>
+        <w:t>[2] 李海峰, 王炜. 生成式人工智能时代的学生作业设计与评价[J]. 开放教育研究, 2023, 29(3): 31-39. DOI:10.13966/j.cnki.kfjyyj.2023.03.003.</w:t>
       </w:r>
     </w:p>
     <w:p>
@@ -5887,7 +6560,7 @@
           <w:color w:val="000000"/>
           <w:sz w:val="21"/>
         </w:rPr>
-        <w:t>[3] 李海峰, 王炜. 生成式人工智能时代的学生作业设计与评价[J]. 开放教育研究, 2023, 29(3): 31-39. DOI:10.13966/j.cnki.kfjyyj.2023.03.003.</w:t>
+        <w:t>[3] WANG H, WANG C, CHEN Z, et al. Impact of AI-agent-supported collaborative learning on the learning outcomes of University programming courses[J]. Education and Information Technologies, 2025, 30: 17717-17749. DOI:10.1007/s10639-025-13487-8.</w:t>
       </w:r>
     </w:p>
     <w:p>
@@ -5902,7 +6575,7 @@
           <w:color w:val="000000"/>
           <w:sz w:val="21"/>
         </w:rPr>
-        <w:t>[4] 王一岩, 刘淇, 郑永和. 人机协同学习：实践逻辑与典型模式[J]. 开放教育研究, 2024, 30(1): 65-72. DOI:10.13966/j.cnki.kfjyyj.2024.01.007.</w:t>
+        <w:t>[4] GAO W, LIU Q, YUE L, et al. Agent4Edu: Generating Learner Response Data by Generative Agents for Intelligent Education Systems[C]. AAAI-25, 2025.</w:t>
       </w:r>
     </w:p>
     <w:p>
@@ -5917,7 +6590,7 @@
           <w:color w:val="000000"/>
           <w:sz w:val="21"/>
         </w:rPr>
-        <w:t>[5] 董艳, 夏亮亮, 李心怡, 等. ChatGPT赋能学生学习的路径探析[J]. 电化教育研究, 2023, 44(12): 14-20, 34. DOI:10.13811/j.cnki.eer.2023.12.002.</w:t>
+        <w:t>[5] XU S, WEN H N, PAN H, et al. Classroom Simulacra: Building Contextual Student Generative Agents in Online Education for Learning Behavioral Simulation[C]//CHI '25. Yokohama: ACM, 2025: 26 p. DOI:10.1145/3706598.3713773.</w:t>
       </w:r>
     </w:p>
     <w:p>
@@ -5932,7 +6605,7 @@
           <w:color w:val="000000"/>
           <w:sz w:val="21"/>
         </w:rPr>
-        <w:t>[6] 单俊豪, 刘永贵. 生成式人工智能赋能学习设计研究[J]. 电化教育研究, 2024, 45(7): 73-80. DOI:10.13811/j.cnki.eer.2024.07.010.</w:t>
+        <w:t>[6] YUSUF H, MONEY A, DAYLAMANI-ZAD D. Pedagogical AI conversational agents in higher education: A conceptual framework and survey of the state of the art[J]. Educational Technology Research and Development, 2025, 73: 815-874. DOI:10.1007/s11423-025-10447-4.</w:t>
       </w:r>
     </w:p>
     <w:p>
@@ -5947,7 +6620,7 @@
           <w:color w:val="000000"/>
           <w:sz w:val="21"/>
         </w:rPr>
-        <w:t>[7] 王佑镁, 王欣颖, 柳晨晨. 教育领域生成式人工智能应用的伦理风险管理框架研究[J]. 电化教育研究, 2024, 45(10): 28-35. DOI:10.13811/j.cnki.eer.2024.10.004.</w:t>
+        <w:t>[7] 孙丹, 朱城聪, 许作栋, 等. 基于生成式人工智能的大学生编程学习行为分析研究[J]. 电化教育研究, 2024, 45(3): 113-120. DOI:10.13811/j.cnki.eer.2024.03.016.</w:t>
       </w:r>
     </w:p>
     <w:p>
@@ -5962,7 +6635,7 @@
           <w:color w:val="000000"/>
           <w:sz w:val="21"/>
         </w:rPr>
-        <w:t>[8] 卢宇, 余京蕾, 陈鹏鹤, 等. 生成式人工智能的教育应用与展望——以ChatGPT系统为例[J]. 中国远程教育, 2023, 43(4): 24-31. DOI:10.13541/j.cnki.chinade.20230301.001.</w:t>
+        <w:t>[8] 吴林静, 戴心来, 赵蔚, 等. 学习分析视域下学习者编程过程分析研究[J]. 现代远距离教育, 2020(2): 68-75.</w:t>
       </w:r>
     </w:p>
     <w:p>
@@ -5977,7 +6650,7 @@
           <w:color w:val="000000"/>
           <w:sz w:val="21"/>
         </w:rPr>
-        <w:t>[9] 杨宗凯, 王俊, 吴砥, 等. ChatGPT/生成式人工智能对教育的影响探析及应对策略[J]. 华东师范大学学报(教育科学版), 2023, 41(7): 26-35. DOI:10.16382/j.cnki.1000-5560.2023.07.003.</w:t>
+        <w:t>[9] 周雪涵, 马莉萍, 郑翔睿. “态度—行为—能力”框架下的大学生生成式人工智能使用研究[J]. 中国电化教育, 2026(5): 57-66.</w:t>
       </w:r>
     </w:p>
     <w:p>
@@ -5992,7 +6665,7 @@
           <w:color w:val="000000"/>
           <w:sz w:val="21"/>
         </w:rPr>
-        <w:t>[10] 杨欣. 基于生成式人工智能的教育转型图景——ChatGPT究竟对教育意味着什么[J]. 中国电化教育, 2023(5): 1-8, 14.</w:t>
+        <w:t>[10] 王一岩, 刘淇, 郑永和. 人机协同学习：实践逻辑与典型模式[J]. 开放教育研究, 2024, 30(1): 65-72. DOI:10.13966/j.cnki.kfjyyj.2024.01.007.</w:t>
       </w:r>
     </w:p>
     <w:p>
@@ -6007,7 +6680,7 @@
           <w:color w:val="000000"/>
           <w:sz w:val="21"/>
         </w:rPr>
-        <w:t>[11] 王佑镁, 王旦, 王海洁, 等. 基于风险性监管的AIGC教育应用伦理风险治理研究[J]. 中国电化教育, 2023(11): 83-90.</w:t>
+        <w:t>[11] CHI M T H, BASSOK M, LEWIS M W, et al. Self-explanations: How students study and use examples in learning to solve problems[J]. Cognitive Science, 1989, 13(2): 145-182. DOI:10.1207/s15516709cog1302_1.</w:t>
       </w:r>
     </w:p>
     <w:p>
@@ -6022,7 +6695,7 @@
           <w:color w:val="000000"/>
           <w:sz w:val="21"/>
         </w:rPr>
-        <w:t>[12] 吴峰, 江凤娟, 王璐莹. 生成式人工智能如何重塑大学生的学习行为[J]. 中国电化教育, 2026(5): 49-56.</w:t>
+        <w:t>[12] RENKL A. Learning from worked-out examples: A study on individual differences[J]. Learning and Instruction, 1997, 7(1): 1-15. DOI:10.1016/S0959-4752(96)00030-5.</w:t>
       </w:r>
     </w:p>
     <w:p>
@@ -6037,7 +6710,7 @@
           <w:color w:val="000000"/>
           <w:sz w:val="21"/>
         </w:rPr>
-        <w:t>[13] 周雪涵, 马莉萍, 郑翔睿. “态度—行为—能力”框架下的大学生生成式人工智能使用研究[J]. 中国电化教育, 2026(5): 57-66.</w:t>
+        <w:t>[13] BICHLER S, STADLER M, BÜHNER M, et al. Learning to solve ill-defined statistics problems: Does self-explanation quality mediate the worked example effect?[J]. Instructional Science, 2022, 50: 335-359. DOI:10.1007/s11251-022-09579-4.</w:t>
       </w:r>
     </w:p>
     <w:p>
@@ -6052,7 +6725,7 @@
           <w:color w:val="000000"/>
           <w:sz w:val="21"/>
         </w:rPr>
-        <w:t>[14] 冷静, 王章涵, 李思源, 等. 从单线回应到协商共建：基于IRF理论的人机与师生对话分析[J]. 中国电化教育, 2026(6): 46-54.</w:t>
+        <w:t>[14] HEFTER M H, KUBIK V, BERTHOLD K. Can prompts improve self-explaining an online video lecture? Yes, but do not disturb![J]. International Journal of Educational Technology in Higher Education, 2023, 20: 15. DOI:10.1186/s41239-023-00383-9.</w:t>
       </w:r>
     </w:p>
     <w:p>
@@ -6067,7 +6740,7 @@
           <w:color w:val="000000"/>
           <w:sz w:val="21"/>
         </w:rPr>
-        <w:t>[15] CHI M T H, BASSOK M, LEWIS M W, et al. Self-explanations: How students study and use examples in learning to solve problems[J]. Cognitive Science, 1989, 13(2): 145-182. DOI:10.1207/s15516709cog1302_1.</w:t>
+        <w:t>[15] ERICSON B J, et al. Parsons Problems and Beyond: Systematic Literature Review and Empirical Study Designs[C]//Proceedings of the 2022 Working Group Reports on Innovation and Technology in Computer Science Education. New York: ACM, 2022: 191-234. DOI:10.1145/3571785.3574127.</w:t>
       </w:r>
     </w:p>
     <w:p>
@@ -6082,7 +6755,7 @@
           <w:color w:val="000000"/>
           <w:sz w:val="21"/>
         </w:rPr>
-        <w:t>[16] RENKL A. Learning from worked-out examples: A study on individual differences[J]. Learning and Instruction, 1997, 7(1): 1-15. DOI:10.1016/S0959-4752(96)00030-5.</w:t>
+        <w:t>[16] FIORELLA L, MAYER R E. The relative benefits of learning by teaching and teaching expectancy[J]. Contemporary Educational Psychology, 2013, 38(4): 281-288. DOI:10.1016/j.cedpsych.2013.06.001.</w:t>
       </w:r>
     </w:p>
     <w:p>
@@ -6097,7 +6770,7 @@
           <w:color w:val="000000"/>
           <w:sz w:val="21"/>
         </w:rPr>
-        <w:t>[17] BICHLER S, STADLER M, BÜHNER M, et al. Learning to solve ill-defined statistics problems: Does self-explanation quality mediate the worked example effect?[J]. Instructional Science, 2022, 50: 335-359. DOI:10.1007/s11251-022-09579-4.</w:t>
+        <w:t>[17] CHASE C C, CHIN D B, OPPEZZO M A, et al. Teachable agents and the protégé effect: Increasing the effort towards learning[J]. Journal of Science Education and Technology, 2009, 18: 334-352. DOI:10.1007/s10956-009-9180-4.</w:t>
       </w:r>
     </w:p>
     <w:p>
@@ -6112,7 +6785,7 @@
           <w:color w:val="000000"/>
           <w:sz w:val="21"/>
         </w:rPr>
-        <w:t>[18] HEFTER M H, KUBIK V, BERTHOLD K. Can prompts improve self-explaining an online video lecture? Yes, but do not disturb![J]. International Journal of Educational Technology in Higher Education, 2023, 20: 15. DOI:10.1186/s41239-023-00383-9.</w:t>
+        <w:t>[18] JAEGER A J, et al. The interrelationship between concepts about agency and students’ use of teachable-agent learning technology[J]. Cognitive Research: Principles and Implications, 2019, 4: 47. DOI:10.1186/s41235-019-0163-6.</w:t>
       </w:r>
     </w:p>
     <w:p>
@@ -6127,7 +6800,7 @@
           <w:color w:val="000000"/>
           <w:sz w:val="21"/>
         </w:rPr>
-        <w:t>[19] ERICSON B J, et al. Parsons Problems and Beyond: Systematic Literature Review and Empirical Study Designs[C]//Proceedings of the 2022 Working Group Reports on Innovation and Technology in Computer Science Education. New York: ACM, 2022: 191-234. DOI:10.1145/3571785.3574127.</w:t>
+        <w:t>[19] 冷静, 王章涵, 李思源, 等. 从单线回应到协商共建：基于IRF理论的人机与师生对话分析[J]. 中国电化教育, 2026(6): 46-54.</w:t>
       </w:r>
     </w:p>
     <w:p>
@@ -6142,127 +6815,7 @@
           <w:color w:val="000000"/>
           <w:sz w:val="21"/>
         </w:rPr>
-        <w:t>[20] FIORELLA L, MAYER R E. The relative benefits of learning by teaching and teaching expectancy[J]. Contemporary Educational Psychology, 2013, 38(4): 281-288. DOI:10.1016/j.cedpsych.2013.06.001.</w:t>
-      </w:r>
-    </w:p>
-    <w:p>
-      <w:pPr>
-        <w:spacing w:line="276" w:lineRule="auto" w:after="60"/>
-        <w:ind w:left="420" w:hanging="420"/>
-        <w:jc w:val="left"/>
-      </w:pPr>
-      <w:r>
-        <w:rPr>
-          <w:rFonts w:ascii="Times New Roman" w:hAnsi="Times New Roman" w:eastAsia="宋体"/>
-          <w:color w:val="000000"/>
-          <w:sz w:val="21"/>
-        </w:rPr>
-        <w:t>[21] CHASE C C, CHIN D B, OPPEZZO M A, et al. Teachable agents and the protégé effect: Increasing the effort towards learning[J]. Journal of Science Education and Technology, 2009, 18: 334-352. DOI:10.1007/s10956-009-9180-4.</w:t>
-      </w:r>
-    </w:p>
-    <w:p>
-      <w:pPr>
-        <w:spacing w:line="276" w:lineRule="auto" w:after="60"/>
-        <w:ind w:left="420" w:hanging="420"/>
-        <w:jc w:val="left"/>
-      </w:pPr>
-      <w:r>
-        <w:rPr>
-          <w:rFonts w:ascii="Times New Roman" w:hAnsi="Times New Roman" w:eastAsia="宋体"/>
-          <w:color w:val="000000"/>
-          <w:sz w:val="21"/>
-        </w:rPr>
-        <w:t>[22] KUHAIL M A, ALTURKI N, ALRAMLAWI S, et al. Interacting with educational chatbots: A systematic review[J]. Education and Information Technologies, 2023, 28: 9739-9788. DOI:10.1007/s10639-022-11177-3.</w:t>
-      </w:r>
-    </w:p>
-    <w:p>
-      <w:pPr>
-        <w:spacing w:line="276" w:lineRule="auto" w:after="60"/>
-        <w:ind w:left="420" w:hanging="420"/>
-        <w:jc w:val="left"/>
-      </w:pPr>
-      <w:r>
-        <w:rPr>
-          <w:rFonts w:ascii="Times New Roman" w:hAnsi="Times New Roman" w:eastAsia="宋体"/>
-          <w:color w:val="000000"/>
-          <w:sz w:val="21"/>
-        </w:rPr>
-        <w:t>[23] JAEGER A J, et al. The interrelationship between concepts about agency and students’ use of teachable-agent learning technology[J]. Cognitive Research: Principles and Implications, 2019, 4: 47. DOI:10.1186/s41235-019-0163-6.</w:t>
-      </w:r>
-    </w:p>
-    <w:p>
-      <w:pPr>
-        <w:spacing w:line="276" w:lineRule="auto" w:after="60"/>
-        <w:ind w:left="420" w:hanging="420"/>
-        <w:jc w:val="left"/>
-      </w:pPr>
-      <w:r>
-        <w:rPr>
-          <w:rFonts w:ascii="Times New Roman" w:hAnsi="Times New Roman" w:eastAsia="宋体"/>
-          <w:color w:val="000000"/>
-          <w:sz w:val="21"/>
-        </w:rPr>
-        <w:t>[24] OUYANG F, DAI X, CHEN S. Applying multimodal learning analytics to examine the immediate and delayed effects of instructor scaffoldings on small groups’ collaborative programming[J]. International Journal of STEM Education, 2022, 9: 45. DOI:10.1186/s40594-022-00361-z.</w:t>
-      </w:r>
-    </w:p>
-    <w:p>
-      <w:pPr>
-        <w:spacing w:line="276" w:lineRule="auto" w:after="60"/>
-        <w:ind w:left="420" w:hanging="420"/>
-        <w:jc w:val="left"/>
-      </w:pPr>
-      <w:r>
-        <w:rPr>
-          <w:rFonts w:ascii="Times New Roman" w:hAnsi="Times New Roman" w:eastAsia="宋体"/>
-          <w:color w:val="000000"/>
-          <w:sz w:val="21"/>
-        </w:rPr>
-        <w:t>[25] UTAMACHANT P, ANUTARIYA C, PONGNUMKUL S. i-Ntervene: Applying an evidence-based learning analytics intervention to support computer programming instruction[J]. Smart Learning Environments, 2023, 10: 37. DOI:10.1186/s40561-023-00257-7.</w:t>
-      </w:r>
-    </w:p>
-    <w:p>
-      <w:pPr>
-        <w:spacing w:line="276" w:lineRule="auto" w:after="60"/>
-        <w:ind w:left="420" w:hanging="420"/>
-        <w:jc w:val="left"/>
-      </w:pPr>
-      <w:r>
-        <w:rPr>
-          <w:rFonts w:ascii="Times New Roman" w:hAnsi="Times New Roman" w:eastAsia="宋体"/>
-          <w:color w:val="000000"/>
-          <w:sz w:val="21"/>
-        </w:rPr>
-        <w:t>[26] BECKER B A, et al. Programming Is Hard—or at Least It Used to Be: Educational Opportunities and Challenges of AI Code Generation[C]//Proceedings of the 54th ACM Technical Symposium on Computer Science Education V. 1. New York: ACM, 2023: 500-506. DOI:10.1145/3545945.3569759.</w:t>
-      </w:r>
-    </w:p>
-    <w:p>
-      <w:pPr>
-        <w:spacing w:line="276" w:lineRule="auto" w:after="60"/>
-        <w:ind w:left="420" w:hanging="420"/>
-        <w:jc w:val="left"/>
-      </w:pPr>
-      <w:r>
-        <w:rPr>
-          <w:rFonts w:ascii="Times New Roman" w:hAnsi="Times New Roman" w:eastAsia="宋体"/>
-          <w:color w:val="000000"/>
-          <w:sz w:val="21"/>
-        </w:rPr>
-        <w:t>[27] YILMAZ R, YILMAZ F G K. The effect of generative artificial intelligence (AI)-based tool use on students’ computational thinking skills, programming self-efficacy and motivation[J]. Computers in Human Behavior: Artificial Humans, 2023, 1(2): 100005. DOI:10.1016/j.chbah.2023.100005.</w:t>
-      </w:r>
-    </w:p>
-    <w:p>
-      <w:pPr>
-        <w:spacing w:line="276" w:lineRule="auto" w:after="60"/>
-        <w:ind w:left="420" w:hanging="420"/>
-        <w:jc w:val="left"/>
-      </w:pPr>
-      <w:r>
-        <w:rPr>
-          <w:rFonts w:ascii="Times New Roman" w:hAnsi="Times New Roman" w:eastAsia="宋体"/>
-          <w:color w:val="000000"/>
-          <w:sz w:val="21"/>
-        </w:rPr>
-        <w:t>[28] KASNECI E, et al. ChatGPT for good? On opportunities and challenges of large language models for education[J]. Learning and Individual Differences, 2023, 103: 102274. DOI:10.1016/j.lindif.2023.102274.</w:t>
+        <w:t>[20] ZHANG X, ZHANG C, SUN J, et al. EduPlanner: LLM-Based Multi-Agent Systems for Customized and Intelligent Instructional Design[EB/OL]. arXiv:2504.05370, 2025.</w:t>
       </w:r>
     </w:p>
     <w:p>
@@ -10346,36 +10899,6 @@
         </w:tc>
       </w:tr>
     </w:tbl>
-    <w:p>
-      <w:pPr>
-        <w:pStyle w:val="Heading2"/>
-        <w:ind w:firstLine="0"/>
-      </w:pPr>
-      <w:r>
-        <w:rPr>
-          <w:rFonts w:ascii="Times New Roman" w:hAnsi="Times New Roman" w:eastAsia="黑体"/>
-          <w:b/>
-          <w:color w:val="000000"/>
-          <w:sz w:val="26"/>
-        </w:rPr>
-        <w:t>附录C 数据与复现边界</w:t>
-      </w:r>
-    </w:p>
-    <w:p>
-      <w:pPr>
-        <w:spacing w:line="276" w:lineRule="auto" w:after="60"/>
-        <w:ind w:left="420" w:hanging="420"/>
-        <w:jc w:val="left"/>
-      </w:pPr>
-      <w:r>
-        <w:rPr>
-          <w:rFonts w:ascii="Times New Roman" w:hAnsi="Times New Roman" w:eastAsia="宋体"/>
-          <w:color w:val="000000"/>
-          <w:sz w:val="21"/>
-        </w:rPr>
-        <w:t>匿名结果表、分析脚本和绘图脚本随项目保存。原始研究ZIP、匿名密钥、学生代码和对话正文不进入仓库。若期刊要求复核，可提供字段字典、去标识汇总结果和受控分析说明，不公开能够回溯个体的原始事件序列。</w:t>
-      </w:r>
-    </w:p>
     <w:sectPr>
       <w:footerReference w:type="default" r:id="rId9"/>
       <w:pgSz w:w="11906" w:h="16838"/>

</xml_diff>

<commit_message>
docs: publish AI-illustrated mechanism figure
</commit_message>
<xml_diff>
--- a/research/guided_learning_paper/paper_core_zh.docx
+++ b/research/guided_learning_paper/paper_core_zh.docx
@@ -256,7 +256,7 @@
       <w:r>
         <w:drawing>
           <wp:inline xmlns:a="http://schemas.openxmlformats.org/drawingml/2006/main" xmlns:pic="http://schemas.openxmlformats.org/drawingml/2006/picture">
-            <wp:extent cx="5472000" cy="3286647"/>
+            <wp:extent cx="5472000" cy="3078000"/>
             <wp:docPr id="1" name="Picture 1"/>
             <wp:cNvGraphicFramePr>
               <a:graphicFrameLocks noChangeAspect="1"/>
@@ -277,7 +277,7 @@
                   <pic:spPr>
                     <a:xfrm>
                       <a:off x="0" y="0"/>
-                      <a:ext cx="5472000" cy="3286647"/>
+                      <a:ext cx="5472000" cy="3078000"/>
                     </a:xfrm>
                     <a:prstGeom prst="rect"/>
                   </pic:spPr>

</xml_diff>

<commit_message>
docs: adopt English dual-agent framework figure
</commit_message>
<xml_diff>
--- a/research/guided_learning_paper/paper_core_zh.docx
+++ b/research/guided_learning_paper/paper_core_zh.docx
@@ -243,7 +243,7 @@
           <w:color w:val="000000"/>
           <w:sz w:val="22"/>
         </w:rPr>
-        <w:t>本系统没有把三阶段写成固定的认知等级。设计上的递进体现在学生责任变化：第一阶段表达自己的解法；第二阶段识别程序结构并完成缺口；第三阶段面向一个会追问、也会犯错的虚拟学生讲解。三阶段共享同一道作业题，减少任务切换，但分别留下不同的行为证据。</w:t>
+        <w:t>本系统没有把三阶段写成固定的认知等级。设计上的递进体现在学生责任变化：第一阶段表达自己的解法；第二阶段识别程序结构并完成缺口；第三阶段面向一个会追问、也会犯错的虚拟学生讲解。三阶段共享同一道作业题，减少任务切换，但分别留下不同的行为证据。图1从问题情境、角色分工和设计目标三个层面概括整体框架；其中列出的能力是活动设计目标，不是本文已经验证的学习结果。</w:t>
       </w:r>
     </w:p>
     <w:p>
@@ -256,7 +256,7 @@
       <w:r>
         <w:drawing>
           <wp:inline xmlns:a="http://schemas.openxmlformats.org/drawingml/2006/main" xmlns:pic="http://schemas.openxmlformats.org/drawingml/2006/picture">
-            <wp:extent cx="5472000" cy="3078000"/>
+            <wp:extent cx="5472000" cy="3613719"/>
             <wp:docPr id="1" name="Picture 1"/>
             <wp:cNvGraphicFramePr>
               <a:graphicFrameLocks noChangeAspect="1"/>
@@ -265,7 +265,7 @@
               <a:graphicData uri="http://schemas.openxmlformats.org/drawingml/2006/picture">
                 <pic:pic>
                   <pic:nvPicPr>
-                    <pic:cNvPr id="0" name="activity_chain_evidence.png"/>
+                    <pic:cNvPr id="0" name="teacher_framework_english_ai.png"/>
                     <pic:cNvPicPr/>
                   </pic:nvPicPr>
                   <pic:blipFill>
@@ -277,7 +277,7 @@
                   <pic:spPr>
                     <a:xfrm>
                       <a:off x="0" y="0"/>
-                      <a:ext cx="5472000" cy="3078000"/>
+                      <a:ext cx="5472000" cy="3613719"/>
                     </a:xfrm>
                     <a:prstGeom prst="rect"/>
                   </pic:spPr>
@@ -301,7 +301,7 @@
           <w:color w:val="000000"/>
           <w:sz w:val="21"/>
         </w:rPr>
-        <w:t>图1 三阶段活动链及平台可观察证据</w:t>
+        <w:t>图1 问题情境与双智能体协同学习设计框架</w:t>
       </w:r>
     </w:p>
     <w:p>

</xml_diff>